<commit_message>
docs: add RFC 8032 and heavy-hitters references, fix [9], left-align bibliography
</commit_message>
<xml_diff>
--- a/competition_entry/docs/v4/PrivEdge_作品报告_评审整编版_20261019.docx
+++ b/competition_entry/docs/v4/PrivEdge_作品报告_评审整编版_20261019.docx
@@ -3237,7 +3237,7 @@
           <w:sz w:val="24"/>
           <w:szCs w:val="24"/>
         </w:rPr>
-        <w:t>OLH适合大类别域，是因为单条报告的通信量不随类别总数线性增长。PrivEdge的实际改动在于把估计结果组织成带窗口、来源、样本数、方差和签名的稀疏摘要，并把后续的来源准入与鲁棒融合纳入同一条可审计流水线。它没有声称重新提出OLH或继承其全部重频项识别算法。</w:t>
+        <w:t>OLH适合大类别域，是因为单条报告的通信量不随类别总数线性增长。PrivEdge的实际改动在于把估计结果组织成带窗口、来源、样本数、方差和签名的稀疏摘要，并把后续的来源准入与鲁棒融合纳入同一条可审计流水线。它没有声称重新提出OLH或继承其全部重频项识别算法[12]。</w:t>
       </w:r>
     </w:p>
     <w:p>
@@ -8260,7 +8260,7 @@
           <w:sz w:val="24"/>
           <w:szCs w:val="24"/>
         </w:rPr>
-        <w:t>ReleaseEnvelope将发布源、窗口、类别域、机制及哈希族、隐私预算、用户数、Top-m条目、尾部界与过滤说明封装为一个信封。seal在正文中补充key_id、created_at与随机nonce，再对排序键、紧凑分隔符、UTF-8编码的规范化JSON签名；signature字段自身不属于被签正文。登记摘要值digest同时绑定正文和签名。</w:t>
+        <w:t>ReleaseEnvelope将发布源、窗口、类别域、机制及哈希族、隐私预算、用户数、Top-m条目、尾部界与过滤说明封装为一个信封。seal在正文中补充key_id、created_at与随机nonce，再对排序键、紧凑分隔符、UTF-8编码的规范化JSON签名（Ed25519[11]）；signature字段自身不属于被签正文。登记摘要值digest同时绑定正文和签名。</w:t>
       </w:r>
     </w:p>
     <w:tbl>
@@ -26158,6 +26158,7 @@
       <w:pPr>
         <w:widowControl/>
         <w:spacing w:line="360" w:lineRule="auto"/>
+        <w:jc w:val="left"/>
       </w:pPr>
       <w:r>
         <w:rPr>
@@ -26352,6 +26353,7 @@
       <w:pPr>
         <w:widowControl/>
         <w:spacing w:line="360" w:lineRule="auto"/>
+        <w:jc w:val="left"/>
       </w:pPr>
       <w:r>
         <w:rPr>
@@ -26359,13 +26361,14 @@
           <w:sz w:val="24"/>
           <w:szCs w:val="24"/>
         </w:rPr>
-        <w:t>[9] B. Blanchet. Modeling and Verifying Security Protocols with the Applied Pi Calculus and ProVerif. Foundations and Trends in Privacy and Security, 2016. 工具与说明：https://bblanche.gitlabpages.inria.fr/proverif/</w:t>
+        <w:t>[9] B. Blanchet. Modeling and Verifying Security Protocols with the Applied Pi Calculus and ProVerif. Foundations and Trends in Privacy and Security, 1(1–2):1–219, 2016. 工具与说明：https://bblanche.gitlabpages.inria.fr/proverif/</w:t>
       </w:r>
     </w:p>
     <w:p>
       <w:pPr>
         <w:widowControl/>
         <w:spacing w:line="360" w:lineRule="auto"/>
+        <w:jc w:val="left"/>
       </w:pPr>
       <w:r>
         <w:rPr>
@@ -26374,6 +26377,36 @@
           <w:szCs w:val="24"/>
         </w:rPr>
         <w:t>[10] B. Laurie, A. Langley, E. Kasper. Certificate Transparency. RFC 6962, 2013. 本稿引用历史设计，不把它作为当前部署规范：https://www.rfc-editor.org/info/rfc6962/</w:t>
+      </w:r>
+    </w:p>
+    <w:p>
+      <w:pPr>
+        <w:widowControl/>
+        <w:spacing w:line="360" w:lineRule="auto"/>
+        <w:jc w:val="left"/>
+      </w:pPr>
+      <w:r>
+        <w:rPr>
+          <w:rFonts w:ascii="宋体" w:hAnsi="宋体" w:eastAsia="宋体" w:cs="宋体"/>
+          <w:sz w:val="24"/>
+          <w:szCs w:val="24"/>
+        </w:rPr>
+        <w:t xml:space="preserve">[11] J. Josefsson, I. Liusvaara. Edwards-Curve Digital Signature Algorithm (EdDSA). RFC 8032, 2017. https://www.rfc-editor.org/rfc/rfc8032</w:t>
+      </w:r>
+    </w:p>
+    <w:p>
+      <w:pPr>
+        <w:widowControl/>
+        <w:spacing w:line="360" w:lineRule="auto"/>
+        <w:jc w:val="left"/>
+      </w:pPr>
+      <w:r>
+        <w:rPr>
+          <w:rFonts w:ascii="宋体" w:hAnsi="宋体" w:eastAsia="宋体" w:cs="宋体"/>
+          <w:sz w:val="24"/>
+          <w:szCs w:val="24"/>
+        </w:rPr>
+        <w:t xml:space="preserve">[12] R. Bassily, K. Nissim, U. Stemmer, A. Thakurta. Practical Locally Private Heavy Hitters. Advances in Neural Information Processing Systems 30 (NIPS 2017), 2017. https://proceedings.neurips.cc/paper_files/paper/2017/hash/3d779cae2d46cf6a8a99a35ba4167977-Abstract.html</w:t>
       </w:r>
     </w:p>
     <w:p>
@@ -29493,7 +29526,7 @@
           <w:b w:val="0"/>
           <w:sz w:val="24"/>
         </w:rPr>
-        <w:t>本队自有原始研究代码的原样内核与新增工程层分开登记。OLH、MGA和Ed25519等既有方法按实际使用引用，不列为本队独创；文件一致只证明副本一致，不独立证明作者和权利归属。</w:t>
+        <w:t>本队自有原始研究代码的原样内核与新增工程层分开登记。OLH、MGA和Ed25519[11]等既有方法按实际使用引用，不列为本队独创；文件一致只证明副本一致，不独立证明作者和权利归属。</w:t>
       </w:r>
     </w:p>
     <w:p>

</xml_diff>